<commit_message>
Built CRUD Application using API
</commit_message>
<xml_diff>
--- a/AI Intelligence System.docx
+++ b/AI Intelligence System.docx
@@ -286,15 +286,7 @@
       </w:r>
       <w:r>
         <w:br/>
-        <w:t xml:space="preserve">  "</w:t>
-      </w:r>
-      <w:proofErr w:type="spellStart"/>
-      <w:r>
-        <w:t>name":"Deva</w:t>
-      </w:r>
-      <w:proofErr w:type="spellEnd"/>
-      <w:r>
-        <w:t>",</w:t>
+        <w:t xml:space="preserve">  "name":"Deva",</w:t>
       </w:r>
       <w:r>
         <w:br/>
@@ -787,18 +779,10 @@
     <w:p/>
     <w:p>
       <w:r>
-        <w:t>Program -</w:t>
-      </w:r>
-      <w:proofErr w:type="gramStart"/>
-      <w:r>
-        <w:t xml:space="preserve">1 </w:t>
-      </w:r>
-      <w:r>
-        <w:t xml:space="preserve"> (</w:t>
-      </w:r>
-      <w:proofErr w:type="gramEnd"/>
-      <w:r>
-        <w:t>app.py)</w:t>
+        <w:t xml:space="preserve">Program -1 </w:t>
+      </w:r>
+      <w:r>
+        <w:t xml:space="preserve"> (app.py)</w:t>
       </w:r>
     </w:p>
     <w:p>
@@ -808,15 +792,7 @@
     </w:p>
     <w:p>
       <w:r>
-        <w:t xml:space="preserve">def </w:t>
-      </w:r>
-      <w:proofErr w:type="gramStart"/>
-      <w:r>
-        <w:t>add(</w:t>
-      </w:r>
-      <w:proofErr w:type="gramEnd"/>
-      <w:r>
-        <w:t>a, b):</w:t>
+        <w:t>def add(a, b):</w:t>
       </w:r>
       <w:r>
         <w:br/>
@@ -830,21 +806,13 @@
     </w:p>
     <w:p>
       <w:r>
-        <w:t xml:space="preserve">result = </w:t>
-      </w:r>
-      <w:proofErr w:type="gramStart"/>
-      <w:r>
-        <w:t>add(</w:t>
-      </w:r>
-      <w:proofErr w:type="gramEnd"/>
-      <w:r>
-        <w:t>5, 3)</w:t>
+        <w:t>result = add(5, 3)</w:t>
       </w:r>
     </w:p>
     <w:p>
       <w:r>
         <w:pict w14:anchorId="3AF764D9">
-          <v:rect id="_x0000_i1031" style="width:0;height:1.5pt" o:hralign="center" o:hrstd="t" o:hr="t" fillcolor="#a0a0a0" stroked="f"/>
+          <v:rect id="_x0000_i1025" style="width:0;height:1.5pt" o:hralign="center" o:hrstd="t" o:hr="t" fillcolor="#a0a0a0" stroked="f"/>
         </w:pict>
       </w:r>
     </w:p>
@@ -855,27 +823,11 @@
     </w:p>
     <w:p>
       <w:r>
-        <w:t>@</w:t>
-      </w:r>
-      <w:proofErr w:type="gramStart"/>
-      <w:r>
-        <w:t>app.route</w:t>
-      </w:r>
-      <w:proofErr w:type="gramEnd"/>
-      <w:r>
-        <w:t>("/add")</w:t>
+        <w:t>@app.route("/add")</w:t>
       </w:r>
       <w:r>
         <w:br/>
-        <w:t xml:space="preserve">def </w:t>
-      </w:r>
-      <w:proofErr w:type="gramStart"/>
-      <w:r>
-        <w:t>add(</w:t>
-      </w:r>
-      <w:proofErr w:type="gramEnd"/>
-      <w:r>
-        <w:t>):</w:t>
+        <w:t>def add():</w:t>
       </w:r>
       <w:r>
         <w:br/>
@@ -974,40 +926,20 @@
     </w:p>
     <w:p>
       <w:r>
-        <w:t>/</w:t>
-      </w:r>
-      <w:proofErr w:type="spellStart"/>
-      <w:r>
-        <w:t>getAllStudents</w:t>
-      </w:r>
-      <w:proofErr w:type="spellEnd"/>
+        <w:t>/getAllStudents</w:t>
+      </w:r>
       <w:r>
         <w:br/>
-        <w:t>/</w:t>
-      </w:r>
-      <w:proofErr w:type="spellStart"/>
-      <w:r>
-        <w:t>addStudent</w:t>
-      </w:r>
-      <w:proofErr w:type="spellEnd"/>
+        <w:t>/addStudent</w:t>
+      </w:r>
       <w:r>
         <w:br/>
-        <w:t>/</w:t>
-      </w:r>
-      <w:proofErr w:type="spellStart"/>
-      <w:r>
-        <w:t>updateStudent</w:t>
-      </w:r>
-      <w:proofErr w:type="spellEnd"/>
+        <w:t>/updateStudent</w:t>
+      </w:r>
       <w:r>
         <w:br/>
-        <w:t>/</w:t>
-      </w:r>
-      <w:proofErr w:type="spellStart"/>
-      <w:r>
-        <w:t>removeStudent</w:t>
-      </w:r>
-      <w:proofErr w:type="spellEnd"/>
+        <w:t>/removeStudent</w:t>
+      </w:r>
     </w:p>
     <w:p>
       <w:r>
@@ -1017,7 +949,7 @@
     <w:p>
       <w:r>
         <w:pict w14:anchorId="5BA051F0">
-          <v:rect id="_x0000_i1039" style="width:0;height:1.5pt" o:hralign="center" o:hrstd="t" o:hr="t" fillcolor="#a0a0a0" stroked="f"/>
+          <v:rect id="_x0000_i1026" style="width:0;height:1.5pt" o:hralign="center" o:hrstd="t" o:hr="t" fillcolor="#a0a0a0" stroked="f"/>
         </w:pict>
       </w:r>
     </w:p>
@@ -1040,23 +972,7 @@
           <w:b/>
           <w:bCs/>
         </w:rPr>
-        <w:t xml:space="preserve"> – Define Nouns and not </w:t>
-      </w:r>
-      <w:proofErr w:type="gramStart"/>
-      <w:r>
-        <w:rPr>
-          <w:b/>
-          <w:bCs/>
-        </w:rPr>
-        <w:t>verbs ,</w:t>
-      </w:r>
-      <w:proofErr w:type="gramEnd"/>
-      <w:r>
-        <w:rPr>
-          <w:b/>
-          <w:bCs/>
-        </w:rPr>
-        <w:t xml:space="preserve"> Use standard HTTP methods</w:t>
+        <w:t xml:space="preserve"> – Define Nouns and not verbs , Use standard HTTP methods</w:t>
       </w:r>
     </w:p>
     <w:p>
@@ -1097,6 +1013,436 @@
       </w:r>
     </w:p>
     <w:p/>
+    <w:p>
+      <w:r>
+        <w:t>Request</w:t>
+      </w:r>
+    </w:p>
+    <w:p>
+      <w:r>
+        <w:t>When a client (browser, Postman, frontend) contacts your API, it sends a request.</w:t>
+      </w:r>
+    </w:p>
+    <w:p>
+      <w:r>
+        <w:t>Example:</w:t>
+      </w:r>
+    </w:p>
+    <w:p>
+      <w:r>
+        <w:t>POST /students</w:t>
+      </w:r>
+    </w:p>
+    <w:p>
+      <w:r>
+        <w:t>That request contains information.</w:t>
+      </w:r>
+    </w:p>
+    <w:p>
+      <w:r>
+        <w:t>request</w:t>
+      </w:r>
+    </w:p>
+    <w:p>
+      <w:r>
+        <w:lastRenderedPageBreak/>
+        <w:t>│</w:t>
+      </w:r>
+    </w:p>
+    <w:p>
+      <w:r>
+        <w:rPr>
+          <w:rFonts w:ascii="MS Gothic" w:eastAsia="MS Gothic" w:hAnsi="MS Gothic" w:cs="MS Gothic" w:hint="eastAsia"/>
+        </w:rPr>
+        <w:t>├</w:t>
+      </w:r>
+      <w:r>
+        <w:rPr>
+          <w:rFonts w:ascii="Aptos" w:hAnsi="Aptos" w:cs="Aptos"/>
+        </w:rPr>
+        <w:t>──</w:t>
+      </w:r>
+      <w:r>
+        <w:t xml:space="preserve"> method</w:t>
+      </w:r>
+    </w:p>
+    <w:p>
+      <w:r>
+        <w:rPr>
+          <w:rFonts w:ascii="MS Gothic" w:eastAsia="MS Gothic" w:hAnsi="MS Gothic" w:cs="MS Gothic" w:hint="eastAsia"/>
+        </w:rPr>
+        <w:t>├</w:t>
+      </w:r>
+      <w:r>
+        <w:rPr>
+          <w:rFonts w:ascii="Aptos" w:hAnsi="Aptos" w:cs="Aptos"/>
+        </w:rPr>
+        <w:t>──</w:t>
+      </w:r>
+      <w:r>
+        <w:t xml:space="preserve"> headers</w:t>
+      </w:r>
+    </w:p>
+    <w:p>
+      <w:r>
+        <w:rPr>
+          <w:rFonts w:ascii="MS Gothic" w:eastAsia="MS Gothic" w:hAnsi="MS Gothic" w:cs="MS Gothic" w:hint="eastAsia"/>
+        </w:rPr>
+        <w:t>├</w:t>
+      </w:r>
+      <w:r>
+        <w:rPr>
+          <w:rFonts w:ascii="Aptos" w:hAnsi="Aptos" w:cs="Aptos"/>
+        </w:rPr>
+        <w:t>──</w:t>
+      </w:r>
+      <w:r>
+        <w:t xml:space="preserve"> args</w:t>
+      </w:r>
+    </w:p>
+    <w:p>
+      <w:r>
+        <w:rPr>
+          <w:rFonts w:ascii="MS Gothic" w:eastAsia="MS Gothic" w:hAnsi="MS Gothic" w:cs="MS Gothic" w:hint="eastAsia"/>
+        </w:rPr>
+        <w:t>├</w:t>
+      </w:r>
+      <w:r>
+        <w:rPr>
+          <w:rFonts w:ascii="Aptos" w:hAnsi="Aptos" w:cs="Aptos"/>
+        </w:rPr>
+        <w:t>──</w:t>
+      </w:r>
+      <w:r>
+        <w:t xml:space="preserve"> json</w:t>
+      </w:r>
+    </w:p>
+    <w:p>
+      <w:r>
+        <w:t>└── form</w:t>
+      </w:r>
+    </w:p>
+    <w:p>
+      <w:r>
+        <w:t>Flask collects all that information into</w:t>
+      </w:r>
+      <w:r>
+        <w:t xml:space="preserve"> request</w:t>
+      </w:r>
+    </w:p>
+    <w:p>
+      <w:r>
+        <w:t>Query Parameter</w:t>
+      </w:r>
+    </w:p>
+    <w:p>
+      <w:r>
+        <w:t>Suppose you visit:</w:t>
+      </w:r>
+    </w:p>
+    <w:p>
+      <w:r>
+        <w:t>http://127.0.0.1:5000/search?name=Deva</w:t>
+      </w:r>
+    </w:p>
+    <w:p>
+      <w:r>
+        <w:t>/search</w:t>
+      </w:r>
+      <w:r>
+        <w:t xml:space="preserve"> </w:t>
+      </w:r>
+      <w:r>
+        <w:t>is the route.</w:t>
+      </w:r>
+    </w:p>
+    <w:p>
+      <w:r>
+        <w:t>?name=Deva</w:t>
+      </w:r>
+      <w:r>
+        <w:t xml:space="preserve"> </w:t>
+      </w:r>
+      <w:r>
+        <w:t>is a query parameter.</w:t>
+      </w:r>
+    </w:p>
+    <w:p>
+      <w:r>
+        <w:t>from flask import request</w:t>
+      </w:r>
+    </w:p>
+    <w:p>
+      <w:r>
+        <w:t>@app.route("/search")</w:t>
+      </w:r>
+    </w:p>
+    <w:p>
+      <w:r>
+        <w:t>def search():</w:t>
+      </w:r>
+    </w:p>
+    <w:p>
+      <w:r>
+        <w:t xml:space="preserve">    name = request.args.get("name")</w:t>
+      </w:r>
+    </w:p>
+    <w:p>
+      <w:r>
+        <w:t xml:space="preserve">    return f"Hello {name}"</w:t>
+      </w:r>
+    </w:p>
+    <w:p>
+      <w:r>
+        <w:t>RESTAPI</w:t>
+      </w:r>
+    </w:p>
+    <w:p>
+      <w:r>
+        <w:t>@app.route("/students/&lt;int:id&gt;")</w:t>
+      </w:r>
+    </w:p>
+    <w:p>
+      <w:r>
+        <w:t>def get_student(id):</w:t>
+      </w:r>
+    </w:p>
+    <w:p>
+      <w:r>
+        <w:t xml:space="preserve">    return f"Student {id}"</w:t>
+      </w:r>
+    </w:p>
+    <w:p>
+      <w:pPr>
+        <w:rPr>
+          <w:b/>
+          <w:bCs/>
+        </w:rPr>
+      </w:pPr>
+      <w:r>
+        <w:rPr>
+          <w:b/>
+          <w:bCs/>
+        </w:rPr>
+        <w:t>Headers</w:t>
+      </w:r>
+    </w:p>
+    <w:p>
+      <w:r>
+        <w:t>Headers carry extra information.</w:t>
+      </w:r>
+    </w:p>
+    <w:p>
+      <w:r>
+        <w:t>Example:</w:t>
+      </w:r>
+    </w:p>
+    <w:p>
+      <w:r>
+        <w:t>Content-Type: application/json</w:t>
+      </w:r>
+      <w:r>
+        <w:br/>
+        <w:t>Authorization: Bearer xyz123</w:t>
+      </w:r>
+    </w:p>
+    <w:p>
+      <w:r>
+        <w:pict w14:anchorId="558ED7CE">
+          <v:rect id="_x0000_i1033" style="width:0;height:1.5pt" o:hralign="center" o:hrstd="t" o:hr="t" fillcolor="#a0a0a0" stroked="f"/>
+        </w:pict>
+      </w:r>
+    </w:p>
+    <w:p>
+      <w:pPr>
+        <w:rPr>
+          <w:b/>
+          <w:bCs/>
+        </w:rPr>
+      </w:pPr>
+      <w:r>
+        <w:rPr>
+          <w:b/>
+          <w:bCs/>
+        </w:rPr>
+        <w:t>Access Headers</w:t>
+      </w:r>
+    </w:p>
+    <w:p>
+      <w:r>
+        <w:t>@app.route("/test")</w:t>
+      </w:r>
+      <w:r>
+        <w:br/>
+        <w:t>def test():</w:t>
+      </w:r>
+      <w:r>
+        <w:br/>
+        <w:t xml:space="preserve">    token = request.headers.get("Authorization")</w:t>
+      </w:r>
+      <w:r>
+        <w:br/>
+        <w:t xml:space="preserve">    return token</w:t>
+      </w:r>
+    </w:p>
+    <w:p>
+      <w:pPr>
+        <w:rPr>
+          <w:b/>
+          <w:bCs/>
+        </w:rPr>
+      </w:pPr>
+      <w:r>
+        <w:rPr>
+          <w:b/>
+          <w:bCs/>
+        </w:rPr>
+        <w:lastRenderedPageBreak/>
+        <w:t>The Three Most Important Ways Data Reaches Your API</w:t>
+      </w:r>
+    </w:p>
+    <w:p>
+      <w:pPr>
+        <w:rPr>
+          <w:b/>
+          <w:bCs/>
+        </w:rPr>
+      </w:pPr>
+      <w:r>
+        <w:rPr>
+          <w:b/>
+          <w:bCs/>
+        </w:rPr>
+        <w:t>1. Path Parameter</w:t>
+      </w:r>
+    </w:p>
+    <w:p>
+      <w:r>
+        <w:t>/students/5</w:t>
+      </w:r>
+    </w:p>
+    <w:p>
+      <w:r>
+        <w:t>Flask:</w:t>
+      </w:r>
+    </w:p>
+    <w:p>
+      <w:r>
+        <w:t>id</w:t>
+      </w:r>
+    </w:p>
+    <w:p>
+      <w:r>
+        <w:pict w14:anchorId="225DD211">
+          <v:rect id="_x0000_i1047" style="width:0;height:1.5pt" o:hralign="center" o:hrstd="t" o:hr="t" fillcolor="#a0a0a0" stroked="f"/>
+        </w:pict>
+      </w:r>
+    </w:p>
+    <w:p>
+      <w:pPr>
+        <w:rPr>
+          <w:b/>
+          <w:bCs/>
+        </w:rPr>
+      </w:pPr>
+      <w:r>
+        <w:rPr>
+          <w:b/>
+          <w:bCs/>
+        </w:rPr>
+        <w:t>2. Query Parameter</w:t>
+      </w:r>
+    </w:p>
+    <w:p>
+      <w:r>
+        <w:t>/search?name=Deva</w:t>
+      </w:r>
+    </w:p>
+    <w:p>
+      <w:r>
+        <w:t>Flask:</w:t>
+      </w:r>
+    </w:p>
+    <w:p>
+      <w:r>
+        <w:t>request.args.get("name")</w:t>
+      </w:r>
+    </w:p>
+    <w:p>
+      <w:r>
+        <w:pict w14:anchorId="0450A754">
+          <v:rect id="_x0000_i1048" style="width:0;height:1.5pt" o:hralign="center" o:hrstd="t" o:hr="t" fillcolor="#a0a0a0" stroked="f"/>
+        </w:pict>
+      </w:r>
+    </w:p>
+    <w:p>
+      <w:pPr>
+        <w:rPr>
+          <w:b/>
+          <w:bCs/>
+        </w:rPr>
+      </w:pPr>
+      <w:r>
+        <w:rPr>
+          <w:b/>
+          <w:bCs/>
+        </w:rPr>
+        <w:t>3. JSON Body</w:t>
+      </w:r>
+    </w:p>
+    <w:p>
+      <w:r>
+        <w:t>{</w:t>
+      </w:r>
+      <w:r>
+        <w:br/>
+        <w:t xml:space="preserve">   "name":"Deva"</w:t>
+      </w:r>
+      <w:r>
+        <w:br/>
+        <w:t>}</w:t>
+      </w:r>
+    </w:p>
+    <w:p>
+      <w:r>
+        <w:t>Flask:</w:t>
+      </w:r>
+    </w:p>
+    <w:p>
+      <w:r>
+        <w:t>request.json</w:t>
+      </w:r>
+    </w:p>
+    <w:p>
+      <w:r>
+        <w:t>Return Status code along with data</w:t>
+      </w:r>
+    </w:p>
+    <w:p>
+      <w:r>
+        <w:t>200 – OK (Request executed)</w:t>
+      </w:r>
+    </w:p>
+    <w:p>
+      <w:r>
+        <w:t>201 – Creation successful (Data insertion)</w:t>
+      </w:r>
+    </w:p>
+    <w:p>
+      <w:r>
+        <w:t>400 –  Bad Request (Invalid Data)</w:t>
+      </w:r>
+    </w:p>
+    <w:p>
+      <w:r>
+        <w:t>404 – Not found (might be resource)</w:t>
+      </w:r>
+    </w:p>
+    <w:p>
+      <w:r>
+        <w:t>500 – Internal Server error (Server crash – x/0)</w:t>
+      </w:r>
+    </w:p>
     <w:sectPr>
       <w:pgSz w:w="11906" w:h="16838"/>
       <w:pgMar w:top="720" w:right="720" w:bottom="720" w:left="720" w:header="708" w:footer="708" w:gutter="0"/>

</xml_diff>